<commit_message>
Mejorar la internacionalización de mensajes en el controlador de perfil y agregar traducciones al archivo de idioma en inglés.
</commit_message>
<xml_diff>
--- a/Redacción proyecto fin de ciclo - Hugo Maeso.docx
+++ b/Redacción proyecto fin de ciclo - Hugo Maeso.docx
@@ -7041,7 +7041,80 @@
         <w:spacing w:line="276" w:lineRule="auto"/>
       </w:pPr>
       <w:bookmarkStart w:id="12" w:name="_Toc229484835"/>
-      <w:r>
+    </w:p>
+    <w:p>
+      <w:pPr>
+        <w:pStyle w:val="Ttulo2"/>
+        <w:spacing w:line="276" w:lineRule="auto"/>
+      </w:pPr>
+    </w:p>
+    <w:p>
+      <w:pPr>
+        <w:pStyle w:val="Ttulo2"/>
+        <w:spacing w:line="276" w:lineRule="auto"/>
+      </w:pPr>
+    </w:p>
+    <w:p>
+      <w:pPr>
+        <w:pStyle w:val="Ttulo2"/>
+        <w:spacing w:line="276" w:lineRule="auto"/>
+      </w:pPr>
+    </w:p>
+    <w:p>
+      <w:pPr>
+        <w:pStyle w:val="Ttulo2"/>
+        <w:spacing w:line="276" w:lineRule="auto"/>
+      </w:pPr>
+    </w:p>
+    <w:p>
+      <w:pPr>
+        <w:pStyle w:val="Ttulo2"/>
+        <w:spacing w:line="276" w:lineRule="auto"/>
+      </w:pPr>
+    </w:p>
+    <w:p>
+      <w:pPr>
+        <w:pStyle w:val="Ttulo2"/>
+        <w:spacing w:line="276" w:lineRule="auto"/>
+      </w:pPr>
+    </w:p>
+    <w:p>
+      <w:pPr>
+        <w:pStyle w:val="Ttulo2"/>
+        <w:spacing w:line="276" w:lineRule="auto"/>
+      </w:pPr>
+    </w:p>
+    <w:p>
+      <w:pPr>
+        <w:pStyle w:val="Ttulo2"/>
+        <w:spacing w:line="276" w:lineRule="auto"/>
+      </w:pPr>
+    </w:p>
+    <w:p>
+      <w:pPr>
+        <w:pStyle w:val="Ttulo2"/>
+        <w:spacing w:line="276" w:lineRule="auto"/>
+      </w:pPr>
+    </w:p>
+    <w:p>
+      <w:pPr>
+        <w:pStyle w:val="Ttulo2"/>
+        <w:spacing w:line="276" w:lineRule="auto"/>
+      </w:pPr>
+    </w:p>
+    <w:p>
+      <w:pPr>
+        <w:pStyle w:val="Ttulo2"/>
+        <w:spacing w:line="276" w:lineRule="auto"/>
+      </w:pPr>
+    </w:p>
+    <w:p>
+      <w:pPr>
+        <w:pStyle w:val="Ttulo2"/>
+        <w:spacing w:line="276" w:lineRule="auto"/>
+      </w:pPr>
+      <w:r>
+        <w:lastRenderedPageBreak/>
         <w:t>3</w:t>
       </w:r>
       <w:r>
@@ -7051,11 +7124,7 @@
         <w:t>3</w:t>
       </w:r>
       <w:r>
-        <w:t xml:space="preserve"> </w:t>
-      </w:r>
-      <w:r>
-        <w:lastRenderedPageBreak/>
-        <w:t>Planificación</w:t>
+        <w:t xml:space="preserve"> Planificación</w:t>
       </w:r>
       <w:bookmarkEnd w:id="12"/>
     </w:p>

</xml_diff>